<commit_message>
feat(briefe): Abschlussbericht und Klageschrift auf dem Kanzleibriefbogen
Alle vier Briefvorlagen auf den echten Kanzleibriefbogen umgestellt (Arial 12,
Kanzleiblau, Sozietaetsleiste, Betreffblock aus der Aktenlangbezeichnung,
SB-Grussformel mit Unterschrift). "Regulierungsverlauf" statt Zahlungsverlauf.

USt-Regel der RA-Gebuehren: bei vorsteuerabzugsberechtigten Mandanten erstattet
die Gegenseite nur die Nettogebuehren -- Klageantrag 2 netto, Gebuehrentabelle
ohne USt-Zeile, "kostenfrei" entfaellt dort.

Vorlagenpflege ueber tools/patch_briefvorlagen.py.

Co-Authored-By: Claude Opus 5 (1M context) <noreply@anthropic.com>
</commit_message>
<xml_diff>
--- a/Documents/Projekt/Version 1.00/unfallakten/backend/word/abrechnungsuebersicht_vorlage.docx
+++ b/Documents/Projekt/Version 1.00/unfallakten/backend/word/abrechnungsuebersicht_vorlage.docx
@@ -2646,62 +2646,7 @@
         <w:sz w:val="22"/>
         <w:szCs w:val="22"/>
       </w:rPr>
-      <w:fldChar w:fldCharType="begin"/>
-    </w:r>
-    <w:r>
-      <w:rPr>
-        <w:rStyle w:val="Seitenzahl"/>
-        <w:rFonts w:ascii="Arial" w:hAnsi="Arial" w:cs="Arial"/>
-        <w:sz w:val="22"/>
-        <w:szCs w:val="22"/>
-      </w:rPr>
-      <w:instrText xml:space="preserve"/>
-    </w:r>
-    <w:r>
-      <w:rPr>
-        <w:rStyle w:val="Seitenzahl"/>
-        <w:rFonts w:ascii="Arial" w:hAnsi="Arial" w:cs="Arial"/>
-        <w:sz w:val="22"/>
-        <w:szCs w:val="22"/>
-      </w:rPr>
-      <w:instrText>TIME yyyy \@ "d. MMMM yyyy"</w:instrText>
-    </w:r>
-    <w:r>
-      <w:rPr>
-        <w:rStyle w:val="Seitenzahl"/>
-        <w:rFonts w:ascii="Arial" w:hAnsi="Arial" w:cs="Arial"/>
-        <w:sz w:val="22"/>
-        <w:szCs w:val="22"/>
-      </w:rPr>
-      <w:instrText xml:space="preserve"/>
-    </w:r>
-    <w:r>
-      <w:rPr>
-        <w:rStyle w:val="Seitenzahl"/>
-        <w:rFonts w:ascii="Arial" w:hAnsi="Arial" w:cs="Arial"/>
-        <w:sz w:val="22"/>
-        <w:szCs w:val="22"/>
-      </w:rPr>
-      <w:fldChar w:fldCharType="separate"/>
-    </w:r>
-    <w:r>
-      <w:rPr>
-        <w:rStyle w:val="Seitenzahl"/>
-        <w:rFonts w:ascii="Arial" w:hAnsi="Arial" w:cs="Arial"/>
-        <w:noProof/>
-        <w:sz w:val="22"/>
-        <w:szCs w:val="22"/>
-      </w:rPr>
-      <w:t>12. März 2026</w:t>
-    </w:r>
-    <w:r>
-      <w:rPr>
-        <w:rStyle w:val="Seitenzahl"/>
-        <w:rFonts w:ascii="Arial" w:hAnsi="Arial" w:cs="Arial"/>
-        <w:sz w:val="22"/>
-        <w:szCs w:val="22"/>
-      </w:rPr>
-      <w:fldChar w:fldCharType="end"/>
+      <w:t>{{DATUM}}</w:t>
     </w:r>
   </w:p>
   <w:p>

</xml_diff>